<commit_message>
Initalise GLFW & Cmake
</commit_message>
<xml_diff>
--- a/ProjectDefinition.docx
+++ b/ProjectDefinition.docx
@@ -242,9 +242,8 @@
           <w:color w:val="333333"/>
           <w:sz w:val="26"/>
           <w:szCs w:val="26"/>
-          <w:highlight w:val="red"/>
-        </w:rPr>
-        <w:t>FILL IN</w:t>
+        </w:rPr>
+        <w:t>Amudhavel Jayavel.</w:t>
       </w:r>
     </w:p>
     <w:p>
@@ -1731,8 +1730,6 @@
         <w:jc w:val="both"/>
         <w:rPr>
           <w:rFonts w:ascii="Arial" w:eastAsia="Arial" w:hAnsi="Arial" w:cs="Arial"/>
-          <w:b/>
-          <w:bCs/>
           <w:color w:val="333333"/>
           <w:sz w:val="26"/>
           <w:szCs w:val="26"/>
@@ -1770,6 +1767,26 @@
           <w:szCs w:val="26"/>
         </w:rPr>
         <w:t>.Student Signature:</w:t>
+      </w:r>
+      <w:r>
+        <w:rPr>
+          <w:rFonts w:ascii="Arial" w:eastAsia="Arial" w:hAnsi="Arial" w:cs="Arial"/>
+          <w:b/>
+          <w:bCs/>
+          <w:color w:val="333333"/>
+          <w:sz w:val="26"/>
+          <w:szCs w:val="26"/>
+        </w:rPr>
+        <w:t xml:space="preserve"> </w:t>
+      </w:r>
+      <w:r>
+        <w:rPr>
+          <w:rFonts w:ascii="Arial" w:eastAsia="Arial" w:hAnsi="Arial" w:cs="Arial"/>
+          <w:color w:val="333333"/>
+          <w:sz w:val="26"/>
+          <w:szCs w:val="26"/>
+        </w:rPr>
+        <w:t>Corey Medland.</w:t>
       </w:r>
     </w:p>
     <w:p>
@@ -1867,6 +1884,29 @@
           <w:szCs w:val="26"/>
         </w:rPr>
         <w:t>.Date:</w:t>
+      </w:r>
+      <w:r>
+        <w:rPr>
+          <w:rFonts w:ascii="Arial" w:eastAsia="Arial" w:hAnsi="Arial" w:cs="Arial"/>
+          <w:b/>
+          <w:bCs/>
+          <w:color w:val="333333"/>
+          <w:sz w:val="26"/>
+          <w:szCs w:val="26"/>
+        </w:rPr>
+        <w:t xml:space="preserve"> </w:t>
+      </w:r>
+      <w:r>
+        <w:rPr>
+          <w:rFonts w:ascii="Arial" w:eastAsia="Arial" w:hAnsi="Arial" w:cs="Arial"/>
+          <w:b/>
+          <w:bCs/>
+          <w:color w:val="333333"/>
+          <w:sz w:val="26"/>
+          <w:szCs w:val="26"/>
+          <w:highlight w:val="red"/>
+        </w:rPr>
+        <w:t>Fill Before Handing In</w:t>
       </w:r>
     </w:p>
     <w:sectPr>
@@ -2906,7 +2946,6 @@
   <w:style w:type="character" w:default="1" w:styleId="DefaultParagraphFont">
     <w:name w:val="Default Paragraph Font"/>
     <w:uiPriority w:val="1"/>
-    <w:semiHidden/>
     <w:unhideWhenUsed/>
   </w:style>
   <w:style w:type="table" w:default="1" w:styleId="TableNormal">

</xml_diff>